<commit_message>
SWD frequency correction by Abeer
</commit_message>
<xml_diff>
--- a/docs/Dev-Files/INSTRUCTION TO FLASH STM32 ON EZLO AWARE.docx
+++ b/docs/Dev-Files/INSTRUCTION TO FLASH STM32 ON EZLO AWARE.docx
@@ -7,25 +7,7 @@
         <w:pStyle w:val="Heading1"/>
       </w:pPr>
       <w:r>
-        <w:t xml:space="preserve">INSTRUCTION TO FLASH </w:t>
-      </w:r>
-      <w:bookmarkStart w:id="0" w:name="_GoBack"/>
-      <w:proofErr w:type="spellStart"/>
-      <w:r>
-        <w:t>STM32</w:t>
-      </w:r>
-      <w:bookmarkEnd w:id="0"/>
-      <w:proofErr w:type="spellEnd"/>
-      <w:r>
-        <w:t xml:space="preserve"> ON </w:t>
-      </w:r>
-      <w:proofErr w:type="spellStart"/>
-      <w:r>
-        <w:t>EZLO</w:t>
-      </w:r>
-      <w:proofErr w:type="spellEnd"/>
-      <w:r>
-        <w:t xml:space="preserve"> AWARE</w:t>
+        <w:t>INSTRUCTION TO FLASH STM32 ON EZLO AWARE</w:t>
       </w:r>
     </w:p>
     <w:p/>
@@ -261,7 +243,21 @@
         <w:rPr>
           <w:b/>
         </w:rPr>
-        <w:t>400KHz</w:t>
+        <w:t>40</w:t>
+      </w:r>
+      <w:r>
+        <w:rPr>
+          <w:b/>
+        </w:rPr>
+        <w:t>0</w:t>
+      </w:r>
+      <w:bookmarkStart w:id="0" w:name="_GoBack"/>
+      <w:bookmarkEnd w:id="0"/>
+      <w:r>
+        <w:rPr>
+          <w:b/>
+        </w:rPr>
+        <w:t>0KHz</w:t>
       </w:r>
       <w:r>
         <w:t xml:space="preserve">, Reset Mode should be </w:t>

</xml_diff>

<commit_message>
Corrections in sound sensor flashing doc from Abeer
</commit_message>
<xml_diff>
--- a/docs/Dev-Files/INSTRUCTION TO FLASH STM32 ON EZLO AWARE.docx
+++ b/docs/Dev-Files/INSTRUCTION TO FLASH STM32 ON EZLO AWARE.docx
@@ -1,6 +1,6 @@
 
 <file path=word/document.xml><?xml version="1.0" encoding="utf-8"?>
-<w:document xmlns:wpc="http://schemas.microsoft.com/office/word/2010/wordprocessingCanvas" xmlns:mc="http://schemas.openxmlformats.org/markup-compatibility/2006" xmlns:o="urn:schemas-microsoft-com:office:office" xmlns:r="http://schemas.openxmlformats.org/officeDocument/2006/relationships" xmlns:m="http://schemas.openxmlformats.org/officeDocument/2006/math" xmlns:v="urn:schemas-microsoft-com:vml" xmlns:wp14="http://schemas.microsoft.com/office/word/2010/wordprocessingDrawing" xmlns:wp="http://schemas.openxmlformats.org/drawingml/2006/wordprocessingDrawing" xmlns:w10="urn:schemas-microsoft-com:office:word" xmlns:w="http://schemas.openxmlformats.org/wordprocessingml/2006/main" xmlns:w14="http://schemas.microsoft.com/office/word/2010/wordml" xmlns:w15="http://schemas.microsoft.com/office/word/2012/wordml" xmlns:wpg="http://schemas.microsoft.com/office/word/2010/wordprocessingGroup" xmlns:wpi="http://schemas.microsoft.com/office/word/2010/wordprocessingInk" xmlns:wne="http://schemas.microsoft.com/office/word/2006/wordml" xmlns:wps="http://schemas.microsoft.com/office/word/2010/wordprocessingShape" mc:Ignorable="w14 w15 wp14">
+<w:document xmlns:wpc="http://schemas.microsoft.com/office/word/2010/wordprocessingCanvas" xmlns:cx="http://schemas.microsoft.com/office/drawing/2014/chartex" xmlns:cx1="http://schemas.microsoft.com/office/drawing/2015/9/8/chartex" xmlns:mc="http://schemas.openxmlformats.org/markup-compatibility/2006" xmlns:o="urn:schemas-microsoft-com:office:office" xmlns:r="http://schemas.openxmlformats.org/officeDocument/2006/relationships" xmlns:m="http://schemas.openxmlformats.org/officeDocument/2006/math" xmlns:v="urn:schemas-microsoft-com:vml" xmlns:wp14="http://schemas.microsoft.com/office/word/2010/wordprocessingDrawing" xmlns:wp="http://schemas.openxmlformats.org/drawingml/2006/wordprocessingDrawing" xmlns:w10="urn:schemas-microsoft-com:office:word" xmlns:w="http://schemas.openxmlformats.org/wordprocessingml/2006/main" xmlns:w14="http://schemas.microsoft.com/office/word/2010/wordml" xmlns:w15="http://schemas.microsoft.com/office/word/2012/wordml" xmlns:w16se="http://schemas.microsoft.com/office/word/2015/wordml/symex" xmlns:wpg="http://schemas.microsoft.com/office/word/2010/wordprocessingGroup" xmlns:wpi="http://schemas.microsoft.com/office/word/2010/wordprocessingInk" xmlns:wne="http://schemas.microsoft.com/office/word/2006/wordml" xmlns:wps="http://schemas.microsoft.com/office/word/2010/wordprocessingShape" mc:Ignorable="w14 w15 w16se wp14">
   <w:body>
     <w:p>
       <w:pPr>
@@ -18,8 +18,13 @@
       <w:r>
         <w:t xml:space="preserve">in </w:t>
       </w:r>
-      <w:r>
-        <w:t>Ezlo Aware for flashing the STM32 DSP Microcontroller and receiving sound input. Both methods are listed below</w:t>
+      <w:proofErr w:type="spellStart"/>
+      <w:r>
+        <w:t>Ezlo</w:t>
+      </w:r>
+      <w:proofErr w:type="spellEnd"/>
+      <w:r>
+        <w:t xml:space="preserve"> Aware for flashing the STM32 DSP Microcontroller and receiving sound input. Both methods are listed below</w:t>
       </w:r>
     </w:p>
     <w:p>
@@ -239,6 +244,7 @@
       <w:r>
         <w:t xml:space="preserve">, Frequency should be </w:t>
       </w:r>
+      <w:proofErr w:type="gramStart"/>
       <w:r>
         <w:rPr>
           <w:b/>
@@ -251,14 +257,13 @@
         </w:rPr>
         <w:t>0</w:t>
       </w:r>
-      <w:bookmarkStart w:id="0" w:name="_GoBack"/>
-      <w:bookmarkEnd w:id="0"/>
       <w:r>
         <w:rPr>
           <w:b/>
         </w:rPr>
         <w:t>0KHz</w:t>
       </w:r>
+      <w:proofErr w:type="gramEnd"/>
       <w:r>
         <w:t xml:space="preserve">, Reset Mode should be </w:t>
       </w:r>
@@ -353,13 +358,105 @@
         </w:numPr>
       </w:pPr>
       <w:r>
-        <w:t xml:space="preserve">Once successful, reboot </w:t>
-      </w:r>
-      <w:r>
-        <w:rPr>
-          <w:b/>
-        </w:rPr>
-        <w:t xml:space="preserve">Ezlo Aware </w:t>
+        <w:t xml:space="preserve">Short bridges </w:t>
+      </w:r>
+      <w:r>
+        <w:rPr>
+          <w:b/>
+        </w:rPr>
+        <w:t xml:space="preserve">SB1 (compulsory) </w:t>
+      </w:r>
+      <w:r>
+        <w:t xml:space="preserve">and </w:t>
+      </w:r>
+      <w:r>
+        <w:rPr>
+          <w:b/>
+        </w:rPr>
+        <w:t xml:space="preserve">SB2 (optional) </w:t>
+      </w:r>
+      <w:r>
+        <w:t>as shown in image below.</w:t>
+      </w:r>
+    </w:p>
+    <w:p>
+      <w:pPr>
+        <w:ind w:left="720"/>
+        <w:rPr>
+          <w:b/>
+        </w:rPr>
+      </w:pPr>
+      <w:r>
+        <w:rPr>
+          <w:noProof/>
+        </w:rPr>
+        <w:drawing>
+          <wp:inline distT="0" distB="0" distL="0" distR="0" wp14:anchorId="0E7575C9" wp14:editId="61FC5B1A">
+            <wp:extent cx="5495925" cy="4486275"/>
+            <wp:effectExtent l="0" t="0" r="9525" b="9525"/>
+            <wp:docPr id="3" name="Picture 3"/>
+            <wp:cNvGraphicFramePr>
+              <a:graphicFrameLocks xmlns:a="http://schemas.openxmlformats.org/drawingml/2006/main" noChangeAspect="1"/>
+            </wp:cNvGraphicFramePr>
+            <a:graphic xmlns:a="http://schemas.openxmlformats.org/drawingml/2006/main">
+              <a:graphicData uri="http://schemas.openxmlformats.org/drawingml/2006/picture">
+                <pic:pic xmlns:pic="http://schemas.openxmlformats.org/drawingml/2006/picture">
+                  <pic:nvPicPr>
+                    <pic:cNvPr id="1" name=""/>
+                    <pic:cNvPicPr/>
+                  </pic:nvPicPr>
+                  <pic:blipFill>
+                    <a:blip r:embed="rId7"/>
+                    <a:stretch>
+                      <a:fillRect/>
+                    </a:stretch>
+                  </pic:blipFill>
+                  <pic:spPr>
+                    <a:xfrm>
+                      <a:off x="0" y="0"/>
+                      <a:ext cx="5495925" cy="4486275"/>
+                    </a:xfrm>
+                    <a:prstGeom prst="rect">
+                      <a:avLst/>
+                    </a:prstGeom>
+                  </pic:spPr>
+                </pic:pic>
+              </a:graphicData>
+            </a:graphic>
+          </wp:inline>
+        </w:drawing>
+      </w:r>
+    </w:p>
+    <w:p>
+      <w:pPr>
+        <w:pStyle w:val="ListParagraph"/>
+        <w:numPr>
+          <w:ilvl w:val="0"/>
+          <w:numId w:val="4"/>
+        </w:numPr>
+      </w:pPr>
+      <w:r>
+        <w:t xml:space="preserve">Once </w:t>
+      </w:r>
+      <w:r>
+        <w:t>all done</w:t>
+      </w:r>
+      <w:r>
+        <w:t xml:space="preserve">, reboot </w:t>
+      </w:r>
+      <w:proofErr w:type="spellStart"/>
+      <w:r>
+        <w:rPr>
+          <w:b/>
+        </w:rPr>
+        <w:t>Ezlo</w:t>
+      </w:r>
+      <w:proofErr w:type="spellEnd"/>
+      <w:r>
+        <w:rPr>
+          <w:b/>
+        </w:rPr>
+        <w:t xml:space="preserve"> Aware </w:t>
       </w:r>
       <w:r>
         <w:t>and observe Sound UI Tile behavior.</w:t>
@@ -389,11 +486,19 @@
       <w:r>
         <w:t xml:space="preserve">There is also a capability to flash binary using USB Serial bootloader. In order to do this, take a standard USB cable and tear it from one end to expose the wires. Then make connections with </w:t>
       </w:r>
-      <w:r>
-        <w:rPr>
-          <w:b/>
-        </w:rPr>
-        <w:t xml:space="preserve">Ezlo Aware </w:t>
+      <w:proofErr w:type="spellStart"/>
+      <w:r>
+        <w:rPr>
+          <w:b/>
+        </w:rPr>
+        <w:t>Ezlo</w:t>
+      </w:r>
+      <w:proofErr w:type="spellEnd"/>
+      <w:r>
+        <w:rPr>
+          <w:b/>
+        </w:rPr>
+        <w:t xml:space="preserve"> Aware </w:t>
       </w:r>
       <w:r>
         <w:t>as shown below:</w:t>
@@ -407,6 +512,7 @@
         <w:rPr>
           <w:noProof/>
         </w:rPr>
+        <w:lastRenderedPageBreak/>
         <w:drawing>
           <wp:inline distT="0" distB="0" distL="0" distR="0" wp14:anchorId="4536D1C0" wp14:editId="6CD9C77F">
             <wp:extent cx="5934075" cy="2226365"/>
@@ -423,7 +529,7 @@
                     <pic:cNvPicPr/>
                   </pic:nvPicPr>
                   <pic:blipFill>
-                    <a:blip r:embed="rId7"/>
+                    <a:blip r:embed="rId8"/>
                     <a:stretch>
                       <a:fillRect/>
                     </a:stretch>
@@ -473,7 +579,7 @@
                     <pic:cNvPicPr/>
                   </pic:nvPicPr>
                   <pic:blipFill>
-                    <a:blip r:embed="rId8"/>
+                    <a:blip r:embed="rId9"/>
                     <a:stretch>
                       <a:fillRect/>
                     </a:stretch>
@@ -508,33 +614,33 @@
         </w:numPr>
       </w:pPr>
       <w:r>
+        <w:t xml:space="preserve">Once connected, make the following jumper connections as shown below and </w:t>
+      </w:r>
+      <w:r>
+        <w:rPr>
+          <w:b/>
+        </w:rPr>
+        <w:t xml:space="preserve">reboot </w:t>
+      </w:r>
+      <w:r>
+        <w:t xml:space="preserve">the board after making the jumper connections on </w:t>
+      </w:r>
+      <w:r>
+        <w:rPr>
+          <w:b/>
+        </w:rPr>
+        <w:t>J10 and J11:</w:t>
+      </w:r>
+    </w:p>
+    <w:p>
+      <w:pPr>
+        <w:ind w:left="720"/>
+      </w:pPr>
+      <w:r>
+        <w:rPr>
+          <w:noProof/>
+        </w:rPr>
         <w:lastRenderedPageBreak/>
-        <w:t xml:space="preserve">Once connected, make the following jumper connections as shown below and </w:t>
-      </w:r>
-      <w:r>
-        <w:rPr>
-          <w:b/>
-        </w:rPr>
-        <w:t xml:space="preserve">reboot </w:t>
-      </w:r>
-      <w:r>
-        <w:t xml:space="preserve">the board after making the jumper connections on </w:t>
-      </w:r>
-      <w:r>
-        <w:rPr>
-          <w:b/>
-        </w:rPr>
-        <w:t>J10 and J11:</w:t>
-      </w:r>
-    </w:p>
-    <w:p>
-      <w:pPr>
-        <w:ind w:left="720"/>
-      </w:pPr>
-      <w:r>
-        <w:rPr>
-          <w:noProof/>
-        </w:rPr>
         <w:drawing>
           <wp:inline distT="0" distB="0" distL="0" distR="0" wp14:anchorId="3FCE351B" wp14:editId="125A12A2">
             <wp:extent cx="5943600" cy="3011805"/>
@@ -551,7 +657,7 @@
                     <pic:cNvPicPr/>
                   </pic:nvPicPr>
                   <pic:blipFill>
-                    <a:blip r:embed="rId9"/>
+                    <a:blip r:embed="rId10"/>
                     <a:stretch>
                       <a:fillRect/>
                     </a:stretch>
@@ -637,8 +743,10 @@
         <w:rPr>
           <w:b/>
         </w:rPr>
-        <w:t>s f to h</w:t>
-      </w:r>
+        <w:t>s f to i</w:t>
+      </w:r>
+      <w:bookmarkStart w:id="0" w:name="_GoBack"/>
+      <w:bookmarkEnd w:id="0"/>
       <w:r>
         <w:t xml:space="preserve">. </w:t>
       </w:r>
@@ -679,7 +787,7 @@
                     <pic:cNvPicPr/>
                   </pic:nvPicPr>
                   <pic:blipFill>
-                    <a:blip r:embed="rId10"/>
+                    <a:blip r:embed="rId11"/>
                     <a:stretch>
                       <a:fillRect/>
                     </a:stretch>
@@ -716,11 +824,19 @@
       <w:r>
         <w:t xml:space="preserve">Re-apply power to the </w:t>
       </w:r>
-      <w:r>
-        <w:rPr>
-          <w:b/>
-        </w:rPr>
-        <w:t>Ezlo Aware</w:t>
+      <w:proofErr w:type="spellStart"/>
+      <w:r>
+        <w:rPr>
+          <w:b/>
+        </w:rPr>
+        <w:t>Ezlo</w:t>
+      </w:r>
+      <w:proofErr w:type="spellEnd"/>
+      <w:r>
+        <w:rPr>
+          <w:b/>
+        </w:rPr>
+        <w:t xml:space="preserve"> Aware</w:t>
       </w:r>
       <w:r>
         <w:rPr>
@@ -760,7 +876,7 @@
 </file>
 
 <file path=word/numbering.xml><?xml version="1.0" encoding="utf-8"?>
-<w:numbering xmlns:wpc="http://schemas.microsoft.com/office/word/2010/wordprocessingCanvas" xmlns:mc="http://schemas.openxmlformats.org/markup-compatibility/2006" xmlns:o="urn:schemas-microsoft-com:office:office" xmlns:r="http://schemas.openxmlformats.org/officeDocument/2006/relationships" xmlns:m="http://schemas.openxmlformats.org/officeDocument/2006/math" xmlns:v="urn:schemas-microsoft-com:vml" xmlns:wp14="http://schemas.microsoft.com/office/word/2010/wordprocessingDrawing" xmlns:wp="http://schemas.openxmlformats.org/drawingml/2006/wordprocessingDrawing" xmlns:w10="urn:schemas-microsoft-com:office:word" xmlns:w="http://schemas.openxmlformats.org/wordprocessingml/2006/main" xmlns:w14="http://schemas.microsoft.com/office/word/2010/wordml" xmlns:w15="http://schemas.microsoft.com/office/word/2012/wordml" xmlns:wpg="http://schemas.microsoft.com/office/word/2010/wordprocessingGroup" xmlns:wpi="http://schemas.microsoft.com/office/word/2010/wordprocessingInk" xmlns:wne="http://schemas.microsoft.com/office/word/2006/wordml" xmlns:wps="http://schemas.microsoft.com/office/word/2010/wordprocessingShape" mc:Ignorable="w14 w15 wp14">
+<w:numbering xmlns:wpc="http://schemas.microsoft.com/office/word/2010/wordprocessingCanvas" xmlns:cx="http://schemas.microsoft.com/office/drawing/2014/chartex" xmlns:cx1="http://schemas.microsoft.com/office/drawing/2015/9/8/chartex" xmlns:mc="http://schemas.openxmlformats.org/markup-compatibility/2006" xmlns:o="urn:schemas-microsoft-com:office:office" xmlns:r="http://schemas.openxmlformats.org/officeDocument/2006/relationships" xmlns:m="http://schemas.openxmlformats.org/officeDocument/2006/math" xmlns:v="urn:schemas-microsoft-com:vml" xmlns:wp14="http://schemas.microsoft.com/office/word/2010/wordprocessingDrawing" xmlns:wp="http://schemas.openxmlformats.org/drawingml/2006/wordprocessingDrawing" xmlns:w10="urn:schemas-microsoft-com:office:word" xmlns:w="http://schemas.openxmlformats.org/wordprocessingml/2006/main" xmlns:w14="http://schemas.microsoft.com/office/word/2010/wordml" xmlns:w15="http://schemas.microsoft.com/office/word/2012/wordml" xmlns:w16se="http://schemas.microsoft.com/office/word/2015/wordml/symex" xmlns:wpg="http://schemas.microsoft.com/office/word/2010/wordprocessingGroup" xmlns:wpi="http://schemas.microsoft.com/office/word/2010/wordprocessingInk" xmlns:wne="http://schemas.microsoft.com/office/word/2006/wordml" xmlns:wps="http://schemas.microsoft.com/office/word/2010/wordprocessingShape" mc:Ignorable="w14 w15 w16se wp14">
   <w:abstractNum w:abstractNumId="0" w15:restartNumberingAfterBreak="0">
     <w:nsid w:val="211A1A40"/>
     <w:multiLevelType w:val="hybridMultilevel"/>
@@ -1225,7 +1341,7 @@
 </file>
 
 <file path=word/styles.xml><?xml version="1.0" encoding="utf-8"?>
-<w:styles xmlns:mc="http://schemas.openxmlformats.org/markup-compatibility/2006" xmlns:r="http://schemas.openxmlformats.org/officeDocument/2006/relationships" xmlns:w="http://schemas.openxmlformats.org/wordprocessingml/2006/main" xmlns:w14="http://schemas.microsoft.com/office/word/2010/wordml" xmlns:w15="http://schemas.microsoft.com/office/word/2012/wordml" mc:Ignorable="w14 w15">
+<w:styles xmlns:mc="http://schemas.openxmlformats.org/markup-compatibility/2006" xmlns:r="http://schemas.openxmlformats.org/officeDocument/2006/relationships" xmlns:w="http://schemas.openxmlformats.org/wordprocessingml/2006/main" xmlns:w14="http://schemas.microsoft.com/office/word/2010/wordml" xmlns:w15="http://schemas.microsoft.com/office/word/2012/wordml" xmlns:w16se="http://schemas.microsoft.com/office/word/2015/wordml/symex" mc:Ignorable="w14 w15 w16se">
   <w:docDefaults>
     <w:rPrDefault>
       <w:rPr>

</xml_diff>